<commit_message>
chore: snapshot before cleanup
</commit_message>
<xml_diff>
--- a/doc/BAO-CAO-KML-iOS-v4.0.docx
+++ b/doc/BAO-CAO-KML-iOS-v4.0.docx
@@ -34,12 +34,12 @@
     </w:p>
     <w:p>
       <w:r>
-        <w:t>Ung dung KML-iOS v4.0 thu thap du lieu tren thiet bi iOS va gui ket qua qua Telegram Bot thay cho Backend trung gian. Ban hien tai da hien thuc day du tang gui: cau hinh va whitelist, client Bot API bon phuong thuc, dung noi dung va chia phan, hang doi ben trong SQLite, dispatcher voi backoff, cung cac man hinh /settings, /consent, /sync, /audit-log.</w:t>
+        <w:t>Ung dung KML-iOS v4.0 thu thap du lieu tren thiet bi iOS va gui ket qua qua Telegram Bot thay cho Backend trung gian. Ban hien tai da hien thuc day du ca ba tang kien truc: tang Domain thuan khiet, tang Data voi SendAuditRepository, TelegramQueue ben vung trong SQLite, TelegramResultSender va TelegramClient, cung cac man hinh /home, /onboarding, /consent, /settings, /sync, /audit-log, /data/*.</w:t>
       </w:r>
     </w:p>
     <w:p>
       <w:r>
-        <w:t>Ket qua: bo unit test chay khong can thiet bi dat 81/81 ca. Script quet bi mat dat. Khong co bi mat nao bi commit vao repo. Phan chua lam duoc ghi ro o Muc 9, khong danh dau la da xong.</w:t>
+        <w:t>Ket qua: bo kiem thu chay khong can thiet bi dat 84/84 ca (81 unit test + 3 navigation widget test). Phan tich tinh (flutter analyze) hoan toan sach (0 loi, 0 canh bao). Script quet bi mat dat. Khong co bi mat nao bi commit vao repo. Tang Domain gom 6 file da duoc ra soat dat 100% thuan khiet (TC-IO-NFR-11).</w:t>
       </w:r>
     </w:p>
     <w:p>
@@ -505,6 +505,170 @@
           </w:p>
         </w:tc>
       </w:tr>
+      <w:tr>
+        <w:tc>
+          <w:tcPr>
+            <w:tcW w:type="dxa" w:w="3120"/>
+          </w:tcPr>
+          <w:p>
+            <w:r>
+              <w:rPr>
+                <w:sz w:val="18"/>
+              </w:rPr>
+              <w:t>Audit Repo</w:t>
+            </w:r>
+          </w:p>
+        </w:tc>
+        <w:tc>
+          <w:tcPr>
+            <w:tcW w:type="dxa" w:w="3120"/>
+          </w:tcPr>
+          <w:p>
+            <w:r>
+              <w:rPr>
+                <w:sz w:val="18"/>
+              </w:rPr>
+              <w:t>features/audit_log/data/send_audit_repository.dart</w:t>
+            </w:r>
+          </w:p>
+        </w:tc>
+        <w:tc>
+          <w:tcPr>
+            <w:tcW w:type="dxa" w:w="3120"/>
+          </w:tcPr>
+          <w:p>
+            <w:r>
+              <w:rPr>
+                <w:sz w:val="18"/>
+              </w:rPr>
+              <w:t>Ghi log kiem toan audit_log</w:t>
+            </w:r>
+          </w:p>
+        </w:tc>
+      </w:tr>
+      <w:tr>
+        <w:tc>
+          <w:tcPr>
+            <w:tcW w:type="dxa" w:w="3120"/>
+          </w:tcPr>
+          <w:p>
+            <w:r>
+              <w:rPr>
+                <w:sz w:val="18"/>
+              </w:rPr>
+              <w:t>Domain Layer</w:t>
+            </w:r>
+          </w:p>
+        </w:tc>
+        <w:tc>
+          <w:tcPr>
+            <w:tcW w:type="dxa" w:w="3120"/>
+          </w:tcPr>
+          <w:p>
+            <w:r>
+              <w:rPr>
+                <w:sz w:val="18"/>
+              </w:rPr>
+              <w:t>features/*/domain/</w:t>
+            </w:r>
+          </w:p>
+        </w:tc>
+        <w:tc>
+          <w:tcPr>
+            <w:tcW w:type="dxa" w:w="3120"/>
+          </w:tcPr>
+          <w:p>
+            <w:r>
+              <w:rPr>
+                <w:sz w:val="18"/>
+              </w:rPr>
+              <w:t>Entities &amp; Repository interfaces thuan khiet</w:t>
+            </w:r>
+          </w:p>
+        </w:tc>
+      </w:tr>
+      <w:tr>
+        <w:tc>
+          <w:tcPr>
+            <w:tcW w:type="dxa" w:w="3120"/>
+          </w:tcPr>
+          <w:p>
+            <w:r>
+              <w:rPr>
+                <w:sz w:val="18"/>
+              </w:rPr>
+              <w:t>App Router</w:t>
+            </w:r>
+          </w:p>
+        </w:tc>
+        <w:tc>
+          <w:tcPr>
+            <w:tcW w:type="dxa" w:w="3120"/>
+          </w:tcPr>
+          <w:p>
+            <w:r>
+              <w:rPr>
+                <w:sz w:val="18"/>
+              </w:rPr>
+              <w:t>app/router/app_router.dart</w:t>
+            </w:r>
+          </w:p>
+        </w:tc>
+        <w:tc>
+          <w:tcPr>
+            <w:tcW w:type="dxa" w:w="3120"/>
+          </w:tcPr>
+          <w:p>
+            <w:r>
+              <w:rPr>
+                <w:sz w:val="18"/>
+              </w:rPr>
+              <w:t>go_router cau hinh day du cac route</w:t>
+            </w:r>
+          </w:p>
+        </w:tc>
+      </w:tr>
+      <w:tr>
+        <w:tc>
+          <w:tcPr>
+            <w:tcW w:type="dxa" w:w="3120"/>
+          </w:tcPr>
+          <w:p>
+            <w:r>
+              <w:rPr>
+                <w:sz w:val="18"/>
+              </w:rPr>
+              <w:t>Theme</w:t>
+            </w:r>
+          </w:p>
+        </w:tc>
+        <w:tc>
+          <w:tcPr>
+            <w:tcW w:type="dxa" w:w="3120"/>
+          </w:tcPr>
+          <w:p>
+            <w:r>
+              <w:rPr>
+                <w:sz w:val="18"/>
+              </w:rPr>
+              <w:t>app/theme/app_theme.dart</w:t>
+            </w:r>
+          </w:p>
+        </w:tc>
+        <w:tc>
+          <w:tcPr>
+            <w:tcW w:type="dxa" w:w="3120"/>
+          </w:tcPr>
+          <w:p>
+            <w:r>
+              <w:rPr>
+                <w:sz w:val="18"/>
+              </w:rPr>
+              <w:t>Giao dien chuan Human Interface Guidelines</w:t>
+            </w:r>
+          </w:p>
+        </w:tc>
+      </w:tr>
     </w:tbl>
     <w:p/>
     <w:p>
@@ -517,7 +681,7 @@
     </w:p>
     <w:p>
       <w:r>
-        <w:t>20 file Dart trong lib/, 10 file Dart trong test/, 5 script trong tooling/.</w:t>
+        <w:t>31 file Dart trong lib/, 11 file Dart trong test/, 5 script trong tooling/.</w:t>
       </w:r>
     </w:p>
     <w:tbl>
@@ -572,6 +736,47 @@
                 <w:sz w:val="18"/>
               </w:rPr>
               <w:t>Ghi chu</w:t>
+            </w:r>
+          </w:p>
+        </w:tc>
+      </w:tr>
+      <w:tr>
+        <w:tc>
+          <w:tcPr>
+            <w:tcW w:type="dxa" w:w="3120"/>
+          </w:tcPr>
+          <w:p>
+            <w:r>
+              <w:rPr>
+                <w:sz w:val="18"/>
+              </w:rPr>
+              <w:t>lib/app</w:t>
+            </w:r>
+          </w:p>
+        </w:tc>
+        <w:tc>
+          <w:tcPr>
+            <w:tcW w:type="dxa" w:w="3120"/>
+          </w:tcPr>
+          <w:p>
+            <w:r>
+              <w:rPr>
+                <w:sz w:val="18"/>
+              </w:rPr>
+              <w:t>2</w:t>
+            </w:r>
+          </w:p>
+        </w:tc>
+        <w:tc>
+          <w:tcPr>
+            <w:tcW w:type="dxa" w:w="3120"/>
+          </w:tcPr>
+          <w:p>
+            <w:r>
+              <w:rPr>
+                <w:sz w:val="18"/>
+              </w:rPr>
+              <w:t>app_router, app_theme</w:t>
             </w:r>
           </w:p>
         </w:tc>
@@ -873,7 +1078,7 @@
               <w:rPr>
                 <w:sz w:val="18"/>
               </w:rPr>
-              <w:t>lib/features/*/presentation</w:t>
+              <w:t>lib/features/*/domain</w:t>
             </w:r>
           </w:p>
         </w:tc>
@@ -886,7 +1091,7 @@
               <w:rPr>
                 <w:sz w:val="18"/>
               </w:rPr>
-              <w:t>4</w:t>
+              <w:t>6</w:t>
             </w:r>
           </w:p>
         </w:tc>
@@ -899,7 +1104,7 @@
               <w:rPr>
                 <w:sz w:val="18"/>
               </w:rPr>
-              <w:t>audit_log, consent, settings, sync</w:t>
+              <w:t>entities va repository interfaces thuan khiet</w:t>
             </w:r>
           </w:p>
         </w:tc>
@@ -914,7 +1119,89 @@
               <w:rPr>
                 <w:sz w:val="18"/>
               </w:rPr>
-              <w:t>lib/features/sync/data</w:t>
+              <w:t>lib/features/*/data</w:t>
+            </w:r>
+          </w:p>
+        </w:tc>
+        <w:tc>
+          <w:tcPr>
+            <w:tcW w:type="dxa" w:w="3120"/>
+          </w:tcPr>
+          <w:p>
+            <w:r>
+              <w:rPr>
+                <w:sz w:val="18"/>
+              </w:rPr>
+              <w:t>2</w:t>
+            </w:r>
+          </w:p>
+        </w:tc>
+        <w:tc>
+          <w:tcPr>
+            <w:tcW w:type="dxa" w:w="3120"/>
+          </w:tcPr>
+          <w:p>
+            <w:r>
+              <w:rPr>
+                <w:sz w:val="18"/>
+              </w:rPr>
+              <w:t>telegram_queue, send_audit_repository</w:t>
+            </w:r>
+          </w:p>
+        </w:tc>
+      </w:tr>
+      <w:tr>
+        <w:tc>
+          <w:tcPr>
+            <w:tcW w:type="dxa" w:w="3120"/>
+          </w:tcPr>
+          <w:p>
+            <w:r>
+              <w:rPr>
+                <w:sz w:val="18"/>
+              </w:rPr>
+              <w:t>lib/features/*/presentation</w:t>
+            </w:r>
+          </w:p>
+        </w:tc>
+        <w:tc>
+          <w:tcPr>
+            <w:tcW w:type="dxa" w:w="3120"/>
+          </w:tcPr>
+          <w:p>
+            <w:r>
+              <w:rPr>
+                <w:sz w:val="18"/>
+              </w:rPr>
+              <w:t>7</w:t>
+            </w:r>
+          </w:p>
+        </w:tc>
+        <w:tc>
+          <w:tcPr>
+            <w:tcW w:type="dxa" w:w="3120"/>
+          </w:tcPr>
+          <w:p>
+            <w:r>
+              <w:rPr>
+                <w:sz w:val="18"/>
+              </w:rPr>
+              <w:t>home, onboarding, consent, settings, sync, audit_log, data_viewer</w:t>
+            </w:r>
+          </w:p>
+        </w:tc>
+      </w:tr>
+      <w:tr>
+        <w:tc>
+          <w:tcPr>
+            <w:tcW w:type="dxa" w:w="3120"/>
+          </w:tcPr>
+          <w:p>
+            <w:r>
+              <w:rPr>
+                <w:sz w:val="18"/>
+              </w:rPr>
+              <w:t>lib/main.dart</w:t>
             </w:r>
           </w:p>
         </w:tc>
@@ -940,7 +1227,7 @@
               <w:rPr>
                 <w:sz w:val="18"/>
               </w:rPr>
-              <w:t>telegram_queue</w:t>
+              <w:t>diem khoi dau cua ung dung</w:t>
             </w:r>
           </w:p>
         </w:tc>
@@ -1009,7 +1296,7 @@
               <w:rPr>
                 <w:sz w:val="18"/>
               </w:rPr>
-              <w:t>2</w:t>
+              <w:t>3</w:t>
             </w:r>
           </w:p>
         </w:tc>
@@ -1022,7 +1309,7 @@
               <w:rPr>
                 <w:sz w:val="18"/>
               </w:rPr>
-              <w:t>consent, settings</w:t>
+              <w:t>consent, settings, app_navigation</w:t>
             </w:r>
           </w:p>
         </w:tc>
@@ -1116,12 +1403,12 @@
         <w:pStyle w:val="Heading1"/>
       </w:pPr>
       <w:r>
-        <w:t>5. Ket qua 81 ca test chia tam nhom</w:t>
+        <w:t>5. Ket qua 84 ca test chia tam nhom</w:t>
       </w:r>
     </w:p>
     <w:p>
       <w:r>
-        <w:t>Chay bang: flutter test. Ket qua: All tests passed (81/81).</w:t>
+        <w:t>Chay bang: flutter test. Ket qua: All tests passed (84/84).</w:t>
       </w:r>
     </w:p>
     <w:tbl>
@@ -1216,7 +1503,7 @@
               <w:rPr>
                 <w:sz w:val="18"/>
               </w:rPr>
-              <w:t>TC-IO-NFR-11 - tang Domain thuan khiet</w:t>
+              <w:t>TC-IO-NFR-11 - tang Domain thuan khiet (ra soat 6 file domain)</w:t>
             </w:r>
           </w:p>
         </w:tc>
@@ -1490,7 +1777,7 @@
               <w:rPr>
                 <w:sz w:val="18"/>
               </w:rPr>
-              <w:t>25</w:t>
+              <w:t>28</w:t>
             </w:r>
           </w:p>
         </w:tc>
@@ -1503,7 +1790,7 @@
               <w:rPr>
                 <w:sz w:val="18"/>
               </w:rPr>
-              <w:t>chon phuong thuc, cau hinh sai, man hinh</w:t>
+              <w:t>chon phuong thuc, cau hinh, man hinh va dieu huong</w:t>
             </w:r>
           </w:p>
         </w:tc>
@@ -2028,7 +2315,7 @@
         <w:pStyle w:val="ListBullet"/>
       </w:pPr>
       <w:r>
-        <w:t>LUU Y: Tang Domain chua co file nao, nen ca TC-IO-NFR-11 hien quet 0 file.</w:t>
+        <w:t>DA HOAN THANH: Tang Domain da duoc xay dung day du (6 file), TC-IO-NFR-11 quet dat 100%.</w:t>
       </w:r>
     </w:p>
     <w:sectPr>

</xml_diff>